<commit_message>
fix(templates): add practical_no placeholder to tempitfor65wordtitle.docx
</commit_message>
<xml_diff>
--- a/tempitfor65wordtitle.docx
+++ b/tempitfor65wordtitle.docx
@@ -176,7 +176,7 @@
           </mc:Choice>
           <mc:Fallback>
             <w:pict>
-              <v:line w14:anchorId="4F9FC508" id="Straight Connector 73" o:spid="_x0000_s1026" style="position:absolute;z-index:251661312;visibility:visible;mso-wrap-style:square;mso-wrap-distance-left:9pt;mso-wrap-distance-top:0;mso-wrap-distance-right:9pt;mso-wrap-distance-bottom:0;mso-position-horizontal:absolute;mso-position-horizontal-relative:text;mso-position-vertical:absolute;mso-position-vertical-relative:page" from="291.6pt,222.95pt" to="361.6pt,222.95pt" o:gfxdata="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" strokecolor="black [3200]" strokeweight=".5pt">
+              <v:line w14:anchorId="1E4B6069" id="Straight Connector 73" o:spid="_x0000_s1026" style="position:absolute;z-index:251661312;visibility:visible;mso-wrap-style:square;mso-wrap-distance-left:9pt;mso-wrap-distance-top:0;mso-wrap-distance-right:9pt;mso-wrap-distance-bottom:0;mso-position-horizontal:absolute;mso-position-horizontal-relative:text;mso-position-vertical:absolute;mso-position-vertical-relative:page" from="291.6pt,222.95pt" to="361.6pt,222.95pt" o:gfxdata="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" strokecolor="black [3200]" strokeweight=".5pt">
                 <v:stroke joinstyle="miter"/>
                 <w10:wrap anchory="page"/>
               </v:line>
@@ -302,7 +302,7 @@
           </mc:Choice>
           <mc:Fallback>
             <w:pict>
-              <v:line w14:anchorId="0A2156A3" id="Straight Connector 73" o:spid="_x0000_s1026" style="position:absolute;z-index:251663360;visibility:visible;mso-wrap-style:square;mso-width-percent:0;mso-height-percent:0;mso-wrap-distance-left:9pt;mso-wrap-distance-top:0;mso-wrap-distance-right:9pt;mso-wrap-distance-bottom:0;mso-position-horizontal:absolute;mso-position-horizontal-relative:text;mso-position-vertical:absolute;mso-position-vertical-relative:page;mso-width-percent:0;mso-height-percent:0;mso-width-relative:margin;mso-height-relative:margin" from="93.3pt,263.05pt" to="510.65pt,263.05pt" o:gfxdata="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" strokecolor="black [3200]" strokeweight=".5pt">
+              <v:line w14:anchorId="7C0BBB51" id="Straight Connector 73" o:spid="_x0000_s1026" style="position:absolute;z-index:251663360;visibility:visible;mso-wrap-style:square;mso-width-percent:0;mso-height-percent:0;mso-wrap-distance-left:9pt;mso-wrap-distance-top:0;mso-wrap-distance-right:9pt;mso-wrap-distance-bottom:0;mso-position-horizontal:absolute;mso-position-horizontal-relative:text;mso-position-vertical:absolute;mso-position-vertical-relative:page;mso-width-percent:0;mso-height-percent:0;mso-width-relative:margin;mso-height-relative:margin" from="93.3pt,263.05pt" to="510.65pt,263.05pt" o:gfxdata="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" strokecolor="black [3200]" strokeweight=".5pt">
                 <v:stroke joinstyle="miter"/>
                 <w10:wrap anchory="page"/>
               </v:line>
@@ -418,7 +418,7 @@
           </mc:Choice>
           <mc:Fallback>
             <w:pict>
-              <v:line w14:anchorId="5AE914CF" id="Straight Connector 73" o:spid="_x0000_s1026" style="position:absolute;z-index:251667456;visibility:visible;mso-wrap-style:square;mso-width-percent:0;mso-height-percent:0;mso-wrap-distance-left:9pt;mso-wrap-distance-top:0;mso-wrap-distance-right:9pt;mso-wrap-distance-bottom:0;mso-position-horizontal:absolute;mso-position-horizontal-relative:text;mso-position-vertical:absolute;mso-position-vertical-relative:page;mso-width-percent:0;mso-height-percent:0;mso-width-relative:margin;mso-height-relative:margin" from="356.35pt,281.7pt" to="510.55pt,281.7pt" o:gfxdata="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" strokecolor="black [3200]" strokeweight=".5pt">
+              <v:line w14:anchorId="7687D34B" id="Straight Connector 73" o:spid="_x0000_s1026" style="position:absolute;z-index:251667456;visibility:visible;mso-wrap-style:square;mso-width-percent:0;mso-height-percent:0;mso-wrap-distance-left:9pt;mso-wrap-distance-top:0;mso-wrap-distance-right:9pt;mso-wrap-distance-bottom:0;mso-position-horizontal:absolute;mso-position-horizontal-relative:text;mso-position-vertical:absolute;mso-position-vertical-relative:page;mso-width-percent:0;mso-height-percent:0;mso-width-relative:margin;mso-height-relative:margin" from="356.35pt,281.7pt" to="510.55pt,281.7pt" o:gfxdata="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" strokecolor="black [3200]" strokeweight=".5pt">
                 <v:stroke joinstyle="miter"/>
                 <w10:wrap anchory="page"/>
               </v:line>
@@ -492,7 +492,7 @@
           </mc:Choice>
           <mc:Fallback>
             <w:pict>
-              <v:line w14:anchorId="172ADAE8" id="Straight Connector 73" o:spid="_x0000_s1026" style="position:absolute;z-index:251669504;visibility:visible;mso-wrap-style:square;mso-width-percent:0;mso-height-percent:0;mso-wrap-distance-left:9pt;mso-wrap-distance-top:0;mso-wrap-distance-right:9pt;mso-wrap-distance-bottom:0;mso-position-horizontal:absolute;mso-position-horizontal-relative:text;mso-position-vertical:absolute;mso-position-vertical-relative:page;mso-width-percent:0;mso-height-percent:0;mso-width-relative:margin;mso-height-relative:margin" from="147.3pt,300.65pt" to="510.65pt,300.65pt" o:gfxdata="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" strokecolor="black [3200]" strokeweight=".5pt">
+              <v:line w14:anchorId="7AC5255F" id="Straight Connector 73" o:spid="_x0000_s1026" style="position:absolute;z-index:251669504;visibility:visible;mso-wrap-style:square;mso-width-percent:0;mso-height-percent:0;mso-wrap-distance-left:9pt;mso-wrap-distance-top:0;mso-wrap-distance-right:9pt;mso-wrap-distance-bottom:0;mso-position-horizontal:absolute;mso-position-horizontal-relative:text;mso-position-vertical:absolute;mso-position-vertical-relative:page;mso-width-percent:0;mso-height-percent:0;mso-width-relative:margin;mso-height-relative:margin" from="147.3pt,300.65pt" to="510.65pt,300.65pt" o:gfxdata="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" strokecolor="black [3200]" strokeweight=".5pt">
                 <v:stroke joinstyle="miter"/>
                 <w10:wrap anchory="page"/>
               </v:line>
@@ -566,7 +566,7 @@
           </mc:Choice>
           <mc:Fallback>
             <w:pict>
-              <v:line w14:anchorId="7B8F43E6" id="Straight Connector 73" o:spid="_x0000_s1026" style="position:absolute;z-index:251665408;visibility:visible;mso-wrap-style:square;mso-width-percent:0;mso-height-percent:0;mso-wrap-distance-left:9pt;mso-wrap-distance-top:0;mso-wrap-distance-right:9pt;mso-wrap-distance-bottom:0;mso-position-horizontal:absolute;mso-position-horizontal-relative:text;mso-position-vertical:absolute;mso-position-vertical-relative:page;mso-width-percent:0;mso-height-percent:0;mso-width-relative:margin;mso-height-relative:margin" from="74.65pt,281.7pt" to="4in,281.7pt" o:gfxdata="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" strokecolor="black [3200]" strokeweight=".5pt">
+              <v:line w14:anchorId="7AC3068D" id="Straight Connector 73" o:spid="_x0000_s1026" style="position:absolute;z-index:251665408;visibility:visible;mso-wrap-style:square;mso-width-percent:0;mso-height-percent:0;mso-wrap-distance-left:9pt;mso-wrap-distance-top:0;mso-wrap-distance-right:9pt;mso-wrap-distance-bottom:0;mso-position-horizontal:absolute;mso-position-horizontal-relative:text;mso-position-vertical:absolute;mso-position-vertical-relative:page;mso-width-percent:0;mso-height-percent:0;mso-width-relative:margin;mso-height-relative:margin" from="74.65pt,281.7pt" to="4in,281.7pt" o:gfxdata="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" strokecolor="black [3200]" strokeweight=".5pt">
                 <v:stroke joinstyle="miter"/>
                 <w10:wrap anchory="page"/>
               </v:line>
@@ -766,7 +766,7 @@
           </mc:Choice>
           <mc:Fallback>
             <w:pict>
-              <v:line w14:anchorId="0D6B253D" id="Straight Connector 73" o:spid="_x0000_s1026" style="position:absolute;z-index:251673600;visibility:visible;mso-wrap-style:square;mso-width-percent:0;mso-height-percent:0;mso-wrap-distance-left:9pt;mso-wrap-distance-top:0;mso-wrap-distance-right:9pt;mso-wrap-distance-bottom:0;mso-position-horizontal:absolute;mso-position-horizontal-relative:text;mso-position-vertical:absolute;mso-position-vertical-relative:page;mso-width-percent:0;mso-height-percent:0;mso-width-relative:margin;mso-height-relative:margin" from="333.3pt,319.25pt" to="510.65pt,319.25pt" o:gfxdata="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" strokecolor="black [3200]" strokeweight=".5pt">
+              <v:line w14:anchorId="5E81C111" id="Straight Connector 73" o:spid="_x0000_s1026" style="position:absolute;z-index:251673600;visibility:visible;mso-wrap-style:square;mso-width-percent:0;mso-height-percent:0;mso-wrap-distance-left:9pt;mso-wrap-distance-top:0;mso-wrap-distance-right:9pt;mso-wrap-distance-bottom:0;mso-position-horizontal:absolute;mso-position-horizontal-relative:text;mso-position-vertical:absolute;mso-position-vertical-relative:page;mso-width-percent:0;mso-height-percent:0;mso-width-relative:margin;mso-height-relative:margin" from="333.3pt,319.25pt" to="510.65pt,319.25pt" o:gfxdata="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" strokecolor="black [3200]" strokeweight=".5pt">
                 <v:stroke joinstyle="miter"/>
                 <w10:wrap anchory="page"/>
               </v:line>
@@ -840,7 +840,7 @@
           </mc:Choice>
           <mc:Fallback>
             <w:pict>
-              <v:line w14:anchorId="29ED68E7" id="Straight Connector 73" o:spid="_x0000_s1026" style="position:absolute;z-index:251671552;visibility:visible;mso-wrap-style:square;mso-width-percent:0;mso-height-percent:0;mso-wrap-distance-left:9pt;mso-wrap-distance-top:0;mso-wrap-distance-right:9pt;mso-wrap-distance-bottom:0;mso-position-horizontal:absolute;mso-position-horizontal-relative:text;mso-position-vertical:absolute;mso-position-vertical-relative:page;mso-width-percent:0;mso-height-percent:0;mso-width-relative:margin;mso-height-relative:margin" from="78.75pt,318.95pt" to="280.85pt,318.95pt" o:gfxdata="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" strokecolor="black [3200]" strokeweight=".5pt">
+              <v:line w14:anchorId="698EF716" id="Straight Connector 73" o:spid="_x0000_s1026" style="position:absolute;z-index:251671552;visibility:visible;mso-wrap-style:square;mso-width-percent:0;mso-height-percent:0;mso-wrap-distance-left:9pt;mso-wrap-distance-top:0;mso-wrap-distance-right:9pt;mso-wrap-distance-bottom:0;mso-position-horizontal:absolute;mso-position-horizontal-relative:text;mso-position-vertical:absolute;mso-position-vertical-relative:page;mso-width-percent:0;mso-height-percent:0;mso-width-relative:margin;mso-height-relative:margin" from="78.75pt,318.95pt" to="280.85pt,318.95pt" o:gfxdata="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" strokecolor="black [3200]" strokeweight=".5pt">
                 <v:stroke joinstyle="miter"/>
                 <w10:wrap anchory="page"/>
               </v:line>
@@ -1007,7 +1007,7 @@
           </mc:Choice>
           <mc:Fallback>
             <w:pict>
-              <v:line w14:anchorId="3AAA7C0F" id="Straight Connector 73" o:spid="_x0000_s1026" style="position:absolute;z-index:251675648;visibility:visible;mso-wrap-style:square;mso-width-percent:0;mso-height-percent:0;mso-wrap-distance-left:9pt;mso-wrap-distance-top:0;mso-wrap-distance-right:9pt;mso-wrap-distance-bottom:0;mso-position-horizontal:absolute;mso-position-horizontal-relative:text;mso-position-vertical:absolute;mso-position-vertical-relative:text;mso-width-percent:0;mso-height-percent:0;mso-width-relative:margin;mso-height-relative:margin" from="290.95pt,14.4pt" to="510.5pt,14.4pt" o:gfxdata="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" strokecolor="black [3200]" strokeweight=".5pt">
+              <v:line w14:anchorId="6476E3DE" id="Straight Connector 73" o:spid="_x0000_s1026" style="position:absolute;z-index:251675648;visibility:visible;mso-wrap-style:square;mso-width-percent:0;mso-height-percent:0;mso-wrap-distance-left:9pt;mso-wrap-distance-top:0;mso-wrap-distance-right:9pt;mso-wrap-distance-bottom:0;mso-position-horizontal:absolute;mso-position-horizontal-relative:text;mso-position-vertical:absolute;mso-position-vertical-relative:text;mso-width-percent:0;mso-height-percent:0;mso-width-relative:margin;mso-height-relative:margin" from="290.95pt,14.4pt" to="510.5pt,14.4pt" o:gfxdata="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" strokecolor="black [3200]" strokeweight=".5pt">
                 <v:stroke joinstyle="miter"/>
               </v:line>
             </w:pict>
@@ -1066,7 +1066,7 @@
         <mc:AlternateContent>
           <mc:Choice Requires="wps">
             <w:drawing>
-              <wp:anchor distT="0" distB="0" distL="114300" distR="114300" simplePos="0" relativeHeight="251677696" behindDoc="0" locked="0" layoutInCell="1" allowOverlap="1" wp14:anchorId="73104FB1" wp14:editId="68D45115">
+              <wp:anchor distT="0" distB="0" distL="114300" distR="114300" simplePos="0" relativeHeight="251677696" behindDoc="0" locked="0" layoutInCell="1" allowOverlap="1" wp14:anchorId="73104FB1" wp14:editId="4211C8BB">
                 <wp:simplePos x="0" y="0"/>
                 <wp:positionH relativeFrom="column">
                   <wp:posOffset>542958</wp:posOffset>
@@ -1122,7 +1122,7 @@
           </mc:Choice>
           <mc:Fallback>
             <w:pict>
-              <v:line w14:anchorId="3019412F" id="Straight Connector 73" o:spid="_x0000_s1026" style="position:absolute;z-index:251677696;visibility:visible;mso-wrap-style:square;mso-width-percent:0;mso-height-percent:0;mso-wrap-distance-left:9pt;mso-wrap-distance-top:0;mso-wrap-distance-right:9pt;mso-wrap-distance-bottom:0;mso-position-horizontal:absolute;mso-position-horizontal-relative:text;mso-position-vertical:absolute;mso-position-vertical-relative:page;mso-width-percent:0;mso-height-percent:0;mso-width-relative:margin;mso-height-relative:margin" from="42.75pt,354.3pt" to="510.5pt,354.3pt" o:gfxdata="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" strokecolor="black [3200]" strokeweight=".5pt">
+              <v:line w14:anchorId="7C10C64B" id="Straight Connector 73" o:spid="_x0000_s1026" style="position:absolute;z-index:251677696;visibility:visible;mso-wrap-style:square;mso-width-percent:0;mso-height-percent:0;mso-wrap-distance-left:9pt;mso-wrap-distance-top:0;mso-wrap-distance-right:9pt;mso-wrap-distance-bottom:0;mso-position-horizontal:absolute;mso-position-horizontal-relative:text;mso-position-vertical:absolute;mso-position-vertical-relative:page;mso-width-percent:0;mso-height-percent:0;mso-width-relative:margin;mso-height-relative:margin" from="42.75pt,354.3pt" to="510.5pt,354.3pt" o:gfxdata="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" strokecolor="black [3200]" strokeweight=".5pt">
                 <v:stroke joinstyle="miter"/>
                 <w10:wrap anchory="page"/>
               </v:line>
@@ -1150,7 +1150,7 @@
         <mc:AlternateContent>
           <mc:Choice Requires="wps">
             <w:drawing>
-              <wp:anchor distT="0" distB="0" distL="114300" distR="114300" simplePos="0" relativeHeight="251679744" behindDoc="0" locked="0" layoutInCell="1" allowOverlap="1" wp14:anchorId="79E49503" wp14:editId="3B068C3D">
+              <wp:anchor distT="0" distB="0" distL="114300" distR="114300" simplePos="0" relativeHeight="251679744" behindDoc="0" locked="0" layoutInCell="1" allowOverlap="1" wp14:anchorId="79E49503" wp14:editId="6B4EC39F">
                 <wp:simplePos x="0" y="0"/>
                 <wp:positionH relativeFrom="column">
                   <wp:posOffset>546100</wp:posOffset>
@@ -1206,7 +1206,7 @@
           </mc:Choice>
           <mc:Fallback>
             <w:pict>
-              <v:line w14:anchorId="0D87E896" id="Straight Connector 73" o:spid="_x0000_s1026" style="position:absolute;z-index:251679744;visibility:visible;mso-wrap-style:square;mso-width-percent:0;mso-height-percent:0;mso-wrap-distance-left:9pt;mso-wrap-distance-top:0;mso-wrap-distance-right:9pt;mso-wrap-distance-bottom:0;mso-position-horizontal:absolute;mso-position-horizontal-relative:text;mso-position-vertical:absolute;mso-position-vertical-relative:page;mso-width-percent:0;mso-height-percent:0;mso-width-relative:margin;mso-height-relative:margin" from="43pt,372pt" to="510.75pt,372pt" o:gfxdata="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" strokecolor="black [3200]" strokeweight=".5pt">
+              <v:line w14:anchorId="5D242C9A" id="Straight Connector 73" o:spid="_x0000_s1026" style="position:absolute;z-index:251679744;visibility:visible;mso-wrap-style:square;mso-width-percent:0;mso-height-percent:0;mso-wrap-distance-left:9pt;mso-wrap-distance-top:0;mso-wrap-distance-right:9pt;mso-wrap-distance-bottom:0;mso-position-horizontal:absolute;mso-position-horizontal-relative:text;mso-position-vertical:absolute;mso-position-vertical-relative:page;mso-width-percent:0;mso-height-percent:0;mso-width-relative:margin;mso-height-relative:margin" from="43pt,372pt" to="510.75pt,372pt" o:gfxdata="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" strokecolor="black [3200]" strokeweight=".5pt">
                 <v:stroke joinstyle="miter"/>
                 <w10:wrap anchory="page"/>
               </v:line>
@@ -1225,10 +1225,116 @@
       <w:pPr>
         <w:spacing w:after="132" w:line="276" w:lineRule="auto"/>
         <w:ind w:left="10" w:right="213" w:hanging="10"/>
-        <w:jc w:val="right"/>
+        <w:jc w:val="center"/>
       </w:pPr>
       <w:r>
-        <w:t>Practical/ Term Work No.:  {{practical_no}}</w:t>
+        <w:rPr>
+          <w:rFonts w:ascii="Times New Roman" w:eastAsia="Times New Roman" w:hAnsi="Times New Roman" w:cs="Times New Roman"/>
+          <w:b/>
+          <w:noProof/>
+          <w:sz w:val="28"/>
+        </w:rPr>
+        <mc:AlternateContent>
+          <mc:Choice Requires="wps">
+            <w:drawing>
+              <wp:anchor distT="0" distB="0" distL="114300" distR="114300" simplePos="0" relativeHeight="251683840" behindDoc="0" locked="0" layoutInCell="1" allowOverlap="1" wp14:anchorId="758D7054" wp14:editId="07E32DEA">
+                <wp:simplePos x="0" y="0"/>
+                <wp:positionH relativeFrom="column">
+                  <wp:posOffset>4816327</wp:posOffset>
+                </wp:positionH>
+                <wp:positionV relativeFrom="page">
+                  <wp:posOffset>5187462</wp:posOffset>
+                </wp:positionV>
+                <wp:extent cx="1664873" cy="0"/>
+                <wp:effectExtent l="0" t="0" r="0" b="0"/>
+                <wp:wrapNone/>
+                <wp:docPr id="808880323" name="Straight Connector 73"/>
+                <wp:cNvGraphicFramePr/>
+                <a:graphic xmlns:a="http://schemas.openxmlformats.org/drawingml/2006/main">
+                  <a:graphicData uri="http://schemas.microsoft.com/office/word/2010/wordprocessingShape">
+                    <wps:wsp>
+                      <wps:cNvCnPr/>
+                      <wps:spPr>
+                        <a:xfrm>
+                          <a:off x="0" y="0"/>
+                          <a:ext cx="1664873" cy="0"/>
+                        </a:xfrm>
+                        <a:prstGeom prst="line">
+                          <a:avLst/>
+                        </a:prstGeom>
+                        <a:ln/>
+                      </wps:spPr>
+                      <wps:style>
+                        <a:lnRef idx="1">
+                          <a:schemeClr val="dk1"/>
+                        </a:lnRef>
+                        <a:fillRef idx="0">
+                          <a:schemeClr val="dk1"/>
+                        </a:fillRef>
+                        <a:effectRef idx="0">
+                          <a:schemeClr val="dk1"/>
+                        </a:effectRef>
+                        <a:fontRef idx="minor">
+                          <a:schemeClr val="tx1"/>
+                        </a:fontRef>
+                      </wps:style>
+                      <wps:bodyPr/>
+                    </wps:wsp>
+                  </a:graphicData>
+                </a:graphic>
+                <wp14:sizeRelH relativeFrom="margin">
+                  <wp14:pctWidth>0</wp14:pctWidth>
+                </wp14:sizeRelH>
+              </wp:anchor>
+            </w:drawing>
+          </mc:Choice>
+          <mc:Fallback>
+            <w:pict>
+              <v:line w14:anchorId="0ED3DB58" id="Straight Connector 73" o:spid="_x0000_s1026" style="position:absolute;z-index:251683840;visibility:visible;mso-wrap-style:square;mso-width-percent:0;mso-wrap-distance-left:9pt;mso-wrap-distance-top:0;mso-wrap-distance-right:9pt;mso-wrap-distance-bottom:0;mso-position-horizontal:absolute;mso-position-horizontal-relative:text;mso-position-vertical:absolute;mso-position-vertical-relative:page;mso-width-percent:0;mso-width-relative:margin" from="379.25pt,408.45pt" to="510.35pt,408.45pt" o:gfxdata="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" strokecolor="black [3200]" strokeweight=".5pt">
+                <v:stroke joinstyle="miter"/>
+                <w10:wrap anchory="page"/>
+              </v:line>
+            </w:pict>
+          </mc:Fallback>
+        </mc:AlternateContent>
+      </w:r>
+      <w:r>
+        <w:rPr>
+          <w:rFonts w:ascii="Times New Roman" w:eastAsia="Times New Roman" w:hAnsi="Times New Roman" w:cs="Times New Roman"/>
+          <w:b/>
+          <w:sz w:val="28"/>
+        </w:rPr>
+        <w:t xml:space="preserve">                        </w:t>
+      </w:r>
+      <w:r>
+        <w:rPr>
+          <w:rFonts w:ascii="Times New Roman" w:eastAsia="Times New Roman" w:hAnsi="Times New Roman" w:cs="Times New Roman"/>
+          <w:b/>
+          <w:sz w:val="28"/>
+        </w:rPr>
+        <w:t>Practical/ Term Work No.:</w:t>
+      </w:r>
+      <w:r>
+        <w:rPr>
+          <w:rFonts w:ascii="Times New Roman" w:eastAsia="Times New Roman" w:hAnsi="Times New Roman" w:cs="Times New Roman"/>
+          <w:sz w:val="28"/>
+        </w:rPr>
+        <w:t xml:space="preserve"> </w:t>
+      </w:r>
+      <w:r>
+        <w:rPr>
+          <w:rFonts w:ascii="Times New Roman" w:hAnsi="Times New Roman" w:cs="Times New Roman"/>
+          <w:noProof/>
+          <w:sz w:val="24"/>
+        </w:rPr>
+        <w:t>{{practical_no}}</w:t>
+      </w:r>
+      <w:r>
+        <w:rPr>
+          <w:rFonts w:ascii="Times New Roman" w:eastAsia="Times New Roman" w:hAnsi="Times New Roman" w:cs="Times New Roman"/>
+          <w:sz w:val="28"/>
+        </w:rPr>
+        <w:t xml:space="preserve">             </w:t>
       </w:r>
     </w:p>
     <w:p>
@@ -1396,7 +1502,7 @@
           </mc:Choice>
           <mc:Fallback>
             <w:pict>
-              <v:line w14:anchorId="65558CAB" id="Straight Connector 73" o:spid="_x0000_s1026" style="position:absolute;z-index:251681792;visibility:visible;mso-wrap-style:square;mso-width-percent:0;mso-height-percent:0;mso-wrap-distance-left:9pt;mso-wrap-distance-top:0;mso-wrap-distance-right:9pt;mso-wrap-distance-bottom:0;mso-position-horizontal:absolute;mso-position-horizontal-relative:text;mso-position-vertical:absolute;mso-position-vertical-relative:page;mso-width-percent:0;mso-height-percent:0;mso-width-relative:margin;mso-height-relative:margin" from="118.95pt,543.25pt" to="510.4pt,543.25pt" o:gfxdata="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" strokecolor="black [3200]" strokeweight=".5pt">
+              <v:line w14:anchorId="68D82BA8" id="Straight Connector 73" o:spid="_x0000_s1026" style="position:absolute;z-index:251681792;visibility:visible;mso-wrap-style:square;mso-width-percent:0;mso-height-percent:0;mso-wrap-distance-left:9pt;mso-wrap-distance-top:0;mso-wrap-distance-right:9pt;mso-wrap-distance-bottom:0;mso-position-horizontal:absolute;mso-position-horizontal-relative:text;mso-position-vertical:absolute;mso-position-vertical-relative:page;mso-width-percent:0;mso-height-percent:0;mso-width-relative:margin;mso-height-relative:margin" from="118.95pt,543.25pt" to="510.4pt,543.25pt" o:gfxdata="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" strokecolor="black [3200]" strokeweight=".5pt">
                 <v:stroke joinstyle="miter"/>
                 <w10:wrap anchory="page"/>
               </v:line>
@@ -1938,7 +2044,7 @@
           </mc:Choice>
           <mc:Fallback>
             <w:pict>
-              <v:shape w14:anchorId="63DDCAAE" id="Shape 11813" o:spid="_x0000_s1026" style="position:absolute;margin-left:193.8pt;margin-top:16.95pt;width:106.3pt;height:.7pt;z-index:251660288;visibility:visible;mso-wrap-style:square;mso-wrap-distance-left:9pt;mso-wrap-distance-top:0;mso-wrap-distance-right:9pt;mso-wrap-distance-bottom:0;mso-position-horizontal:absolute;mso-position-horizontal-relative:text;mso-position-vertical:absolute;mso-position-vertical-relative:text;v-text-anchor:top" coordsize="1350518,9144" o:gfxdata="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" path="m,l1350518,r,9144l,9144,,e" fillcolor="black" stroked="f" strokeweight="0">
+              <v:shape w14:anchorId="6E6BB8CC" id="Shape 11813" o:spid="_x0000_s1026" style="position:absolute;margin-left:193.8pt;margin-top:16.95pt;width:106.3pt;height:.7pt;z-index:251660288;visibility:visible;mso-wrap-style:square;mso-wrap-distance-left:9pt;mso-wrap-distance-top:0;mso-wrap-distance-right:9pt;mso-wrap-distance-bottom:0;mso-position-horizontal:absolute;mso-position-horizontal-relative:text;mso-position-vertical:absolute;mso-position-vertical-relative:text;v-text-anchor:top" coordsize="1350518,9144" o:gfxdata="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" path="m,l1350518,r,9144l,9144,,e" fillcolor="black" stroked="f" strokeweight="0">
                 <v:path arrowok="t" textboxrect="0,0,1350518,9144"/>
               </v:shape>
             </w:pict>

</xml_diff>